<commit_message>
Enforce 8pt font and 1.5 line spacing in 5x7 recipe card styles.xml and bust export cache
</commit_message>
<xml_diff>
--- a/backend/assets/5x7_recipe_card.docx
+++ b/backend/assets/5x7_recipe_card.docx
@@ -91,7 +91,7 @@
     </w:tbl>
     <w:p>
       <w:pPr>
-        <w:spacing w:before="0" w:after="0" w:line="240" w:lineRule="auto"/>
+        <w:spacing w:before="0" w:after="0" w:line="360" w:lineRule="auto"/>
       </w:pPr>
       <w:r>
         <w:br w:type="column"/>
@@ -282,7 +282,7 @@
     </w:tbl>
     <w:p>
       <w:pPr>
-        <w:spacing w:before="0" w:after="0" w:line="240" w:lineRule="auto"/>
+        <w:spacing w:before="0" w:after="0" w:line="360" w:lineRule="auto"/>
       </w:pPr>
     </w:p>
     <w:sectPr>
@@ -2360,15 +2360,15 @@
       <w:rPr>
         <w:rFonts w:asciiTheme="minorHAnsi" w:eastAsiaTheme="minorEastAsia" w:hAnsiTheme="minorHAnsi" w:cstheme="minorBidi"/>
         <w:kern w:val="2"/>
-        <w:sz w:val="24"/>
-        <w:szCs w:val="24"/>
+        <w:sz w:val="16"/>
+        <w:szCs w:val="16"/>
         <w:lang w:val="en-US" w:eastAsia="en-US" w:bidi="ar-SA"/>
         <w14:ligatures w14:val="standardContextual"/>
       </w:rPr>
     </w:rPrDefault>
     <w:pPrDefault>
       <w:pPr>
-        <w:spacing w:after="160" w:line="278" w:lineRule="auto"/>
+        <w:spacing w:before="0" w:after="0" w:line="360" w:lineRule="auto"/>
       </w:pPr>
     </w:pPrDefault>
   </w:docDefaults>
@@ -2755,12 +2755,13 @@
     <w:qFormat/>
     <w:rsid w:val="00E54267"/>
     <w:pPr>
-      <w:spacing w:after="0" w:line="307" w:lineRule="auto"/>
+      <w:spacing w:before="0" w:after="0" w:line="360" w:lineRule="auto"/>
     </w:pPr>
     <w:rPr>
       <w:rFonts w:eastAsia="Calibri" w:cs="Calibri"/>
       <w:color w:val="000000"/>
-      <w:sz w:val="14"/>
+      <w:sz w:val="16"/>
+      <w:szCs w:val="16"/>
     </w:rPr>
   </w:style>
   <w:style w:type="paragraph" w:styleId="Heading1">
@@ -2829,8 +2830,12 @@
   <w:style w:type="table" w:customStyle="1" w:styleId="TableGrid">
     <w:name w:val="TableGrid"/>
     <w:pPr>
-      <w:spacing w:after="0" w:line="240" w:lineRule="auto"/>
+      <w:spacing w:before="0" w:after="0" w:line="360" w:lineRule="auto"/>
     </w:pPr>
+    <w:rPr>
+      <w:sz w:val="16"/>
+      <w:szCs w:val="16"/>
+    </w:rPr>
     <w:tblPr>
       <w:tblCellMar>
         <w:top w:w="0" w:type="dxa"/>
@@ -2846,8 +2851,12 @@
     <w:uiPriority w:val="39"/>
     <w:rsid w:val="00922847"/>
     <w:pPr>
-      <w:spacing w:after="0" w:line="240" w:lineRule="auto"/>
+      <w:spacing w:before="0" w:after="0" w:line="360" w:lineRule="auto"/>
     </w:pPr>
+    <w:rPr>
+      <w:sz w:val="16"/>
+      <w:szCs w:val="16"/>
+    </w:rPr>
     <w:tblPr>
       <w:tblBorders>
         <w:top w:val="single" w:sz="4" w:space="0" w:color="auto"/>
@@ -2937,9 +2946,12 @@
     <w:qFormat/>
     <w:rsid w:val="00662933"/>
     <w:pPr>
-      <w:ind w:left="720"/>
-      <w:contextualSpacing/>
+      <w:spacing w:before="0" w:after="0" w:line="360" w:lineRule="auto"/>
     </w:pPr>
+    <w:rPr>
+      <w:sz w:val="16"/>
+      <w:szCs w:val="16"/>
+    </w:rPr>
   </w:style>
   <w:style w:type="paragraph" w:styleId="Subtitle">
     <w:name w:val="Subtitle"/>

</xml_diff>